<commit_message>
Cierre del riesgo R7: prueba en teléfono real (Sprint 2, semana 6)
El sitio publicado en GitHub Pages se probó el 29/09 en un Samsung
Galaxy A16 con Chrome y la disposición se vio correcta. Se actualizan la
matriz de riesgos, el control de desvíos y el informe de pruebas.

Co-Authored-By: Claude Opus 5.5 <noreply@anthropic.com>
</commit_message>
<xml_diff>
--- a/docs/sprint-2/02_Matriz_de_Riesgos.docx
+++ b/docs/sprint-2/02_Matriz_de_Riesgos.docx
@@ -4491,7 +4491,7 @@
               <w:rPr>
                 <w:sz w:val="18"/>
               </w:rPr>
-              <w:t>En monitoreo hasta la prueba en un teléfono real, antes del 02/10. Responsable: Desarrollador.</w:t>
+              <w:t>Cerrado el 29/09: el sitio publicado se probó en un Samsung Galaxy A16 con Chrome y la disposición se vio correcta, sin elementos cortados ni superpuestos. Responsable: Desarrollador.</w:t>
             </w:r>
           </w:p>
         </w:tc>
@@ -4641,7 +4641,7 @@
       </w:r>
       <w:r>
         <w:rPr/>
-        <w:t xml:space="preserve"> De los nueve riesgos, seis se materializaron total o parcialmente (R1, R2, R3, R6, R7 y R8). Todos tenían una respuesta planificada, y en todos esa respuesta alcanzó para cerrarlos o controlarlos antes de que afectaran una entrega. Al 28/09 hay cinco riesgos cerrados (R2, R3, R5, R6 y R8), tres en monitoreo hasta el 02/10 (R1, R7 y R9) y uno con la respuesta aplicada que espera la aprobación del docente (R4).</w:t>
+        <w:t xml:space="preserve"> De los nueve riesgos, seis se materializaron total o parcialmente (R1, R2, R3, R6, R7 y R8). Todos tenían una respuesta planificada, y en todos esa respuesta alcanzó para cerrarlos o controlarlos antes de que afectaran una entrega. Al 29/09 hay seis riesgos cerrados (R2, R3, R5, R6, R7 y R8), dos en monitoreo hasta el 02/10 (R1 y R9) y uno con la respuesta aplicada que espera la aprobación del docente (R4).</w:t>
       </w:r>
     </w:p>
     <w:p>
@@ -4658,7 +4658,7 @@
         <w:keepNext/>
       </w:pPr>
       <w:r>
-        <w:t>Declaro revisados los riesgos del Sprint 2 al 28/09. R4 se cierra con la aprobación de la solicitud de cambio y R7 con la prueba en un teléfono real, ambos antes de la entrega del 02/10.</w:t>
+        <w:t>Declaro revisados los riesgos del Sprint 2 al 28/09. R7 se cerró el 29/09 con la prueba en un teléfono real (Samsung Galaxy A16, Chrome). R4 se cierra con la aprobación de la solicitud de cambio, antes de la entrega del 02/10.</w:t>
       </w:r>
     </w:p>
     <w:p>

</xml_diff>